<commit_message>
Journalspørgsmål i osmose, karse, Peak Flow og vitalkapacitet
Osmose og karse: tolkning, fejlkilder og konklusion flyttet fra
Databehandling til Journalspørgsmål; karse får beregnet vækstrate.
Peak Flow og vitalkapacitet får journalspørgsmål efter originalerne,
vitalkapacitet også kønsforskel i procent.

Co-Authored-By: Claude Opus 5.5 <noreply@anthropic.com>
</commit_message>
<xml_diff>
--- a/Øvelser/Biologi/karse-i-lys-og-morke/karse-i-lys-og-morke.docx
+++ b/Øvelser/Biologi/karse-i-lys-og-morke/karse-i-lys-og-morke.docx
@@ -1,6 +1,6 @@
 
 <file path=word/document.xml><?xml version="1.0" encoding="utf-8"?>
-<w:document xmlns:a="http://schemas.openxmlformats.org/drawingml/2006/main" xmlns:pic="http://schemas.openxmlformats.org/drawingml/2006/picture" xmlns:r="http://schemas.openxmlformats.org/officeDocument/2006/relationships" xmlns:w="http://schemas.openxmlformats.org/wordprocessingml/2006/main" xmlns:wp="http://schemas.openxmlformats.org/drawingml/2006/wordprocessingDrawing">
+<w:document xmlns:a="http://schemas.openxmlformats.org/drawingml/2006/main" xmlns:m="http://schemas.openxmlformats.org/officeDocument/2006/math" xmlns:pic="http://schemas.openxmlformats.org/drawingml/2006/picture" xmlns:r="http://schemas.openxmlformats.org/officeDocument/2006/relationships" xmlns:w="http://schemas.openxmlformats.org/wordprocessingml/2006/main" xmlns:wp="http://schemas.openxmlformats.org/drawingml/2006/wordprocessingDrawing">
   <w:body>
     <w:p>
       <w:pPr>
@@ -441,7 +441,7 @@
                     <a:graphicData uri="http://schemas.openxmlformats.org/drawingml/2006/picture">
                       <pic:pic>
                         <pic:nvPicPr>
-                          <pic:cNvPr descr="/tmp/claude-0/-home-user-smbi/7d291b92-c289-57a9-b4b8-12c4134f11be/scratchpad/qo/quarto-1.10.18/share/formats/docx/tip.png" id="28" name="Picture"/>
+                          <pic:cNvPr descr="/Applications/quarto/share/formats/docx/tip.png" id="28" name="Picture"/>
                           <pic:cNvPicPr>
                             <a:picLocks noChangeArrowheads="1" noChangeAspect="1"/>
                           </pic:cNvPicPr>
@@ -603,7 +603,7 @@
                     <a:graphicData uri="http://schemas.openxmlformats.org/drawingml/2006/picture">
                       <pic:pic>
                         <pic:nvPicPr>
-                          <pic:cNvPr descr="/tmp/claude-0/-home-user-smbi/7d291b92-c289-57a9-b4b8-12c4134f11be/scratchpad/qo/quarto-1.10.18/share/formats/docx/note.png" id="31" name="Picture"/>
+                          <pic:cNvPr descr="/Applications/quarto/share/formats/docx/note.png" id="31" name="Picture"/>
                           <pic:cNvPicPr>
                             <a:picLocks noChangeArrowheads="1" noChangeAspect="1"/>
                           </pic:cNvPicPr>
@@ -2072,13 +2072,13 @@
       </w:tr>
     </w:tbl>
     <w:bookmarkEnd w:id="35"/>
-    <w:bookmarkStart w:id="36" w:name="databehandling-og-rapport"/>
+    <w:bookmarkStart w:id="37" w:name="databehandling"/>
     <w:p>
       <w:pPr>
         <w:pStyle w:val="Heading2"/>
       </w:pPr>
       <w:r>
-        <w:t xml:space="preserve">Databehandling og rapport</w:t>
+        <w:t xml:space="preserve">Databehandling</w:t>
       </w:r>
     </w:p>
     <w:p>
@@ -2090,17 +2090,7 @@
         </w:numPr>
       </w:pPr>
       <w:r>
-        <w:rPr>
-          <w:b/>
-          <w:bCs/>
-        </w:rPr>
-        <w:t xml:space="preserve">Resultater.</w:t>
-      </w:r>
-      <w:r>
-        <w:t xml:space="preserve"> </w:t>
-      </w:r>
-      <w:r>
-        <w:t xml:space="preserve">Beskriv i hele sætninger, hvad I observerede i løbet af de 14 dage. Hvad var sammenhængen mellem planternes højde og tiden? Hvad var sammenhængen mellem planternes højde og lyset? Henvis til skemaet og til jeres fotos med figurnummer og figurtekst.</w:t>
+        <w:t xml:space="preserve">Lav en graf over karsens højde (cm) som funktion af tiden (dage) med begge bakker i samme koordinatsystem, så de kan sammenlignes direkte. Husk aksetitler med enheder, signaturforklaring, figurnummer og figurtekst.</w:t>
       </w:r>
     </w:p>
     <w:p>
@@ -2112,25 +2102,552 @@
         </w:numPr>
       </w:pPr>
       <w:r>
-        <w:rPr>
-          <w:b/>
-          <w:bCs/>
-        </w:rPr>
-        <w:t xml:space="preserve">Grafer.</w:t>
-      </w:r>
-      <w:r>
-        <w:t xml:space="preserve"> </w:t>
-      </w:r>
-      <w:r>
-        <w:t xml:space="preserve">Lav 2–4 grafer over karsens højdevækst som funktion af tiden — husk, at I har to bakker — og sammenlign de to bakker.</w:t>
+        <w:t xml:space="preserve">Beregn den gennemsnitlige vækstrate for hver bakke over hele forsøget, og — hvis kurven har en tydelig stejl del — også i den periode, hvor væksten var hurtigst:</w:t>
       </w:r>
     </w:p>
+    <w:p>
+      <w:pPr>
+        <w:pStyle w:val="FirstParagraph"/>
+      </w:pPr>
+      <m:oMathPara>
+        <m:oMathParaPr>
+          <m:jc m:val="center"/>
+        </m:oMathParaPr>
+        <m:oMath>
+          <m:r>
+            <m:rPr>
+              <m:nor/>
+              <m:sty m:val="p"/>
+            </m:rPr>
+            <m:t>Vækstrate</m:t>
+          </m:r>
+          <m:r>
+            <m:rPr>
+              <m:sty m:val="p"/>
+            </m:rPr>
+            <m:t>=</m:t>
+          </m:r>
+          <m:f>
+            <m:fPr>
+              <m:type m:val="bar"/>
+            </m:fPr>
+            <m:num>
+              <m:sSub>
+                <m:e>
+                  <m:r>
+                    <m:t>h</m:t>
+                  </m:r>
+                </m:e>
+                <m:sub>
+                  <m:r>
+                    <m:rPr>
+                      <m:nor/>
+                      <m:sty m:val="p"/>
+                    </m:rPr>
+                    <m:t>slut</m:t>
+                  </m:r>
+                </m:sub>
+              </m:sSub>
+              <m:r>
+                <m:rPr>
+                  <m:sty m:val="p"/>
+                </m:rPr>
+                <m:t>−</m:t>
+              </m:r>
+              <m:sSub>
+                <m:e>
+                  <m:r>
+                    <m:t>h</m:t>
+                  </m:r>
+                </m:e>
+                <m:sub>
+                  <m:r>
+                    <m:rPr>
+                      <m:nor/>
+                      <m:sty m:val="p"/>
+                    </m:rPr>
+                    <m:t>start</m:t>
+                  </m:r>
+                </m:sub>
+              </m:sSub>
+            </m:num>
+            <m:den>
+              <m:sSub>
+                <m:e>
+                  <m:r>
+                    <m:t>t</m:t>
+                  </m:r>
+                </m:e>
+                <m:sub>
+                  <m:r>
+                    <m:rPr>
+                      <m:nor/>
+                      <m:sty m:val="p"/>
+                    </m:rPr>
+                    <m:t>slut</m:t>
+                  </m:r>
+                </m:sub>
+              </m:sSub>
+              <m:r>
+                <m:rPr>
+                  <m:sty m:val="p"/>
+                </m:rPr>
+                <m:t>−</m:t>
+              </m:r>
+              <m:sSub>
+                <m:e>
+                  <m:r>
+                    <m:t>t</m:t>
+                  </m:r>
+                </m:e>
+                <m:sub>
+                  <m:r>
+                    <m:rPr>
+                      <m:nor/>
+                      <m:sty m:val="p"/>
+                    </m:rPr>
+                    <m:t>start</m:t>
+                  </m:r>
+                </m:sub>
+              </m:sSub>
+            </m:den>
+          </m:f>
+          <m:r>
+            <m:t> </m:t>
+          </m:r>
+          <m:r>
+            <m:rPr>
+              <m:sty m:val="p"/>
+            </m:rPr>
+            <m:t>(</m:t>
+          </m:r>
+          <m:r>
+            <m:rPr>
+              <m:nor/>
+              <m:sty m:val="p"/>
+            </m:rPr>
+            <m:t>cm/døgn</m:t>
+          </m:r>
+          <m:r>
+            <m:rPr>
+              <m:sty m:val="p"/>
+            </m:rPr>
+            <m:t>)</m:t>
+          </m:r>
+        </m:oMath>
+      </m:oMathPara>
+    </w:p>
+    <w:tbl>
+      <w:tblPr>
+        <w:tblStyle w:val="Table"/>
+        <w:tblW w:type="pct" w:w="5000"/>
+        <w:tblLayout w:type="fixed"/>
+        <w:tblLook w:firstRow="0" w:lastRow="0" w:firstColumn="0" w:lastColumn="0" w:noHBand="0" w:noVBand="0" w:val="0000"/>
+      </w:tblPr>
+      <w:tblGrid>
+        <w:gridCol w:w="7920"/>
+      </w:tblGrid>
+      <w:tr>
+        <w:tc>
+          <w:tcPr/>
+          <w:bookmarkStart w:id="36" w:name="tbl-2"/>
+          <w:p>
+            <w:pPr>
+              <w:jc w:val="center"/>
+            </w:pPr>
+            <w:pPr>
+              <w:jc w:val="left"/>
+              <w:spacing w:before="200"/>
+              <w:pStyle w:val="ImageCaption"/>
+            </w:pPr>
+            <w:r>
+              <w:t xml:space="preserve">Tabel 2: Udregnede nøgletal for de to bakker.</w:t>
+            </w:r>
+          </w:p>
+          <w:tbl>
+            <w:tblPr>
+              <w:tblStyle w:val="Table"/>
+              <w:tblW w:type="auto" w:w="0"/>
+              <w:tblLook w:firstRow="1" w:lastRow="0" w:firstColumn="0" w:lastColumn="0" w:noHBand="0" w:noVBand="0" w:val="0020"/>
+            </w:tblPr>
+            <w:tblGrid>
+              <w:gridCol w:w="2640"/>
+              <w:gridCol w:w="2640"/>
+              <w:gridCol w:w="2640"/>
+            </w:tblGrid>
+            <w:tr>
+              <w:trPr>
+                <w:cantSplit/>
+                <w:tblHeader w:val="on"/>
+              </w:trPr>
+              <w:tc>
+                <w:tcPr/>
+                <w:p>
+                  <w:pPr>
+                    <w:pStyle w:val="Compact"/>
+                    <w:keepNext/>
+                  </w:pPr>
+                </w:p>
+              </w:tc>
+              <w:tc>
+                <w:tcPr/>
+                <w:p>
+                  <w:pPr>
+                    <w:pStyle w:val="Compact"/>
+                    <w:keepNext/>
+                    <w:jc w:val="center"/>
+                    <w:jc w:val="center"/>
+                  </w:pPr>
+                  <w:r>
+                    <w:t xml:space="preserve">Lys</w:t>
+                  </w:r>
+                </w:p>
+              </w:tc>
+              <w:tc>
+                <w:tcPr/>
+                <w:p>
+                  <w:pPr>
+                    <w:pStyle w:val="Compact"/>
+                    <w:keepNext/>
+                    <w:jc w:val="center"/>
+                    <w:jc w:val="center"/>
+                  </w:pPr>
+                  <w:r>
+                    <w:t xml:space="preserve">Mørke</w:t>
+                  </w:r>
+                </w:p>
+              </w:tc>
+            </w:tr>
+            <w:tr>
+              <w:trPr>
+                <w:cantSplit/>
+              </w:trPr>
+              <w:tc>
+                <w:tcPr/>
+                <w:p>
+                  <w:pPr>
+                    <w:pStyle w:val="Compact"/>
+                    <w:keepNext/>
+                    <w:jc w:val="left"/>
+                    <w:jc w:val="center"/>
+                  </w:pPr>
+                  <w:r>
+                    <w:t xml:space="preserve">Højde ved forsøgets slutning (cm)</w:t>
+                  </w:r>
+                </w:p>
+              </w:tc>
+              <w:tc>
+                <w:tcPr/>
+                <w:p>
+                  <w:pPr>
+                    <w:pStyle w:val="Compact"/>
+                    <w:keepNext/>
+                  </w:pPr>
+                </w:p>
+              </w:tc>
+              <w:tc>
+                <w:tcPr/>
+                <w:p>
+                  <w:pPr>
+                    <w:pStyle w:val="Compact"/>
+                    <w:keepNext/>
+                  </w:pPr>
+                </w:p>
+              </w:tc>
+            </w:tr>
+            <w:tr>
+              <w:trPr>
+                <w:cantSplit/>
+              </w:trPr>
+              <w:tc>
+                <w:tcPr/>
+                <w:p>
+                  <w:pPr>
+                    <w:pStyle w:val="Compact"/>
+                    <w:keepNext/>
+                    <w:jc w:val="left"/>
+                    <w:jc w:val="center"/>
+                  </w:pPr>
+                  <w:r>
+                    <w:t xml:space="preserve">Gennemsnitlig vækstrate, hele forsøget (cm/døgn)</w:t>
+                  </w:r>
+                </w:p>
+              </w:tc>
+              <w:tc>
+                <w:tcPr/>
+                <w:p>
+                  <w:pPr>
+                    <w:pStyle w:val="Compact"/>
+                    <w:keepNext/>
+                  </w:pPr>
+                </w:p>
+              </w:tc>
+              <w:tc>
+                <w:tcPr/>
+                <w:p>
+                  <w:pPr>
+                    <w:pStyle w:val="Compact"/>
+                    <w:keepNext/>
+                  </w:pPr>
+                </w:p>
+              </w:tc>
+            </w:tr>
+            <w:tr>
+              <w:trPr>
+                <w:cantSplit/>
+              </w:trPr>
+              <w:tc>
+                <w:tcPr/>
+                <w:p>
+                  <w:pPr>
+                    <w:pStyle w:val="Compact"/>
+                    <w:keepNext/>
+                    <w:jc w:val="left"/>
+                    <w:jc w:val="center"/>
+                  </w:pPr>
+                  <w:r>
+                    <w:t xml:space="preserve">Største vækstrate, periode og værdi (cm/døgn)</w:t>
+                  </w:r>
+                </w:p>
+              </w:tc>
+              <w:tc>
+                <w:tcPr/>
+                <w:p>
+                  <w:pPr>
+                    <w:pStyle w:val="Compact"/>
+                    <w:keepNext/>
+                  </w:pPr>
+                </w:p>
+              </w:tc>
+              <w:tc>
+                <w:tcPr/>
+                <w:p>
+                  <w:pPr>
+                    <w:pStyle w:val="Compact"/>
+                    <w:keepNext/>
+                  </w:pPr>
+                </w:p>
+              </w:tc>
+            </w:tr>
+            <w:tr>
+              <w:trPr>
+                <w:cantSplit/>
+              </w:trPr>
+              <w:tc>
+                <w:tcPr/>
+                <w:p>
+                  <w:pPr>
+                    <w:pStyle w:val="Compact"/>
+                    <w:jc w:val="left"/>
+                    <w:jc w:val="center"/>
+                  </w:pPr>
+                  <w:r>
+                    <w:t xml:space="preserve">Dag for første spiring</w:t>
+                  </w:r>
+                </w:p>
+              </w:tc>
+              <w:tc>
+                <w:tcPr/>
+                <w:p>
+                  <w:pPr>
+                    <w:pStyle w:val="Compact"/>
+                  </w:pPr>
+                </w:p>
+              </w:tc>
+              <w:tc>
+                <w:tcPr/>
+                <w:p>
+                  <w:pPr>
+                    <w:pStyle w:val="Compact"/>
+                  </w:pPr>
+                </w:p>
+              </w:tc>
+            </w:tr>
+          </w:tbl>
+          <w:bookmarkEnd w:id="36"/>
+          <w:p/>
+        </w:tc>
+      </w:tr>
+    </w:tbl>
     <w:p>
       <w:pPr>
         <w:pStyle w:val="Compact"/>
         <w:numPr>
           <w:ilvl w:val="0"/>
-          <w:numId w:val="1005"/>
+          <w:numId w:val="1006"/>
+        </w:numPr>
+      </w:pPr>
+      <w:r>
+        <w:t xml:space="preserve">Beskriv kurvernes form: er væksten jævn, accelererende, eller flader den ud mod slutningen? Er der forskel på formen i lys og i mørke?</w:t>
+      </w:r>
+    </w:p>
+    <w:p>
+      <w:pPr>
+        <w:pStyle w:val="Compact"/>
+        <w:numPr>
+          <w:ilvl w:val="0"/>
+          <w:numId w:val="1006"/>
+        </w:numPr>
+      </w:pPr>
+      <w:r>
+        <w:t xml:space="preserve">Har I talt et fast antal frø op, så beregn spiringsprocenten for hver bakke:</w:t>
+      </w:r>
+    </w:p>
+    <w:p>
+      <w:pPr>
+        <w:pStyle w:val="FirstParagraph"/>
+      </w:pPr>
+      <m:oMathPara>
+        <m:oMathParaPr>
+          <m:jc m:val="center"/>
+        </m:oMathParaPr>
+        <m:oMath>
+          <m:r>
+            <m:rPr>
+              <m:nor/>
+              <m:sty m:val="p"/>
+            </m:rPr>
+            <m:t>Spiringsprocent</m:t>
+          </m:r>
+          <m:r>
+            <m:rPr>
+              <m:sty m:val="p"/>
+            </m:rPr>
+            <m:t>=</m:t>
+          </m:r>
+          <m:f>
+            <m:fPr>
+              <m:type m:val="bar"/>
+            </m:fPr>
+            <m:num>
+              <m:r>
+                <m:rPr>
+                  <m:nor/>
+                  <m:sty m:val="p"/>
+                </m:rPr>
+                <m:t>antal spirede frø</m:t>
+              </m:r>
+            </m:num>
+            <m:den>
+              <m:r>
+                <m:rPr>
+                  <m:nor/>
+                  <m:sty m:val="p"/>
+                </m:rPr>
+                <m:t>antal udsåede frø</m:t>
+              </m:r>
+            </m:den>
+          </m:f>
+          <m:r>
+            <m:rPr>
+              <m:sty m:val="p"/>
+            </m:rPr>
+            <m:t>⋅</m:t>
+          </m:r>
+          <m:r>
+            <m:t>100</m:t>
+          </m:r>
+        </m:oMath>
+      </m:oMathPara>
+    </w:p>
+    <w:p>
+      <w:pPr>
+        <w:pStyle w:val="Compact"/>
+        <w:numPr>
+          <w:ilvl w:val="0"/>
+          <w:numId w:val="1007"/>
+        </w:numPr>
+      </w:pPr>
+      <w:r>
+        <w:t xml:space="preserve">Beskriv i hele sætninger, hvad I observerede i løbet af de 14 dage — farve, udseende og højde — og henvis til skemaet og til jeres fotos med figurnummer og figurtekst.</w:t>
+      </w:r>
+    </w:p>
+    <w:bookmarkEnd w:id="37"/>
+    <w:bookmarkStart w:id="38" w:name="journalspørgsmål"/>
+    <w:p>
+      <w:pPr>
+        <w:pStyle w:val="Heading2"/>
+      </w:pPr>
+      <w:r>
+        <w:t xml:space="preserve">Journalspørgsmål</w:t>
+      </w:r>
+    </w:p>
+    <w:p>
+      <w:pPr>
+        <w:pStyle w:val="Compact"/>
+        <w:numPr>
+          <w:ilvl w:val="0"/>
+          <w:numId w:val="1008"/>
+        </w:numPr>
+      </w:pPr>
+      <w:r>
+        <w:t xml:space="preserve">Vurdér jeres to hypoteser ud fra resultaterne: skal de forkastes, eller kan de beholdes indtil videre?</w:t>
+      </w:r>
+    </w:p>
+    <w:p>
+      <w:pPr>
+        <w:pStyle w:val="Compact"/>
+        <w:numPr>
+          <w:ilvl w:val="0"/>
+          <w:numId w:val="1008"/>
+        </w:numPr>
+      </w:pPr>
+      <w:r>
+        <w:t xml:space="preserve">Hvorfor kan karsen i mørke overhovedet spire og vokse i de første dage? Hvor kommer energien og byggestofferne fra, når planten ikke kan lave fotosyntese?</w:t>
+      </w:r>
+    </w:p>
+    <w:p>
+      <w:pPr>
+        <w:pStyle w:val="Compact"/>
+        <w:numPr>
+          <w:ilvl w:val="0"/>
+          <w:numId w:val="1008"/>
+        </w:numPr>
+      </w:pPr>
+      <w:r>
+        <w:t xml:space="preserve">Karse i mørke bliver ofte høj, tynd og gullig (</w:t>
+      </w:r>
+      <w:r>
+        <w:rPr>
+          <w:i/>
+          <w:iCs/>
+        </w:rPr>
+        <w:t xml:space="preserve">etiolering</w:t>
+      </w:r>
+      <w:r>
+        <w:t xml:space="preserve">). Forklar, hvorfor det kan være en fordel for en kimplante under jorden eller i skygge at strække sig mod lyset, og hvorfor bladene ikke bliver grønne.</w:t>
+      </w:r>
+    </w:p>
+    <w:p>
+      <w:pPr>
+        <w:pStyle w:val="Compact"/>
+        <w:numPr>
+          <w:ilvl w:val="0"/>
+          <w:numId w:val="1008"/>
+        </w:numPr>
+      </w:pPr>
+      <w:r>
+        <w:t xml:space="preserve">Skriv reaktionsskemaet for fotosyntesen, og forklar ud fra det, hvorfor karsen i lys kan blive ved med at vokse, mens karsen i mørke på et tidspunkt holder op med at vokse og dør.</w:t>
+      </w:r>
+    </w:p>
+    <w:p>
+      <w:pPr>
+        <w:pStyle w:val="Compact"/>
+        <w:numPr>
+          <w:ilvl w:val="0"/>
+          <w:numId w:val="1008"/>
+        </w:numPr>
+      </w:pPr>
+      <w:r>
+        <w:t xml:space="preserve">Hvorfor er det vigtigt, at de to bakker får samme mængde vat, vand og frø og står ved samme temperatur? Hvilke variable lykkedes det at holde konstante, og hvilke ikke?</w:t>
+      </w:r>
+    </w:p>
+    <w:p>
+      <w:pPr>
+        <w:pStyle w:val="Compact"/>
+        <w:numPr>
+          <w:ilvl w:val="0"/>
+          <w:numId w:val="1008"/>
         </w:numPr>
       </w:pPr>
       <w:r>
@@ -2161,7 +2678,7 @@
         <w:pStyle w:val="Compact"/>
         <w:numPr>
           <w:ilvl w:val="0"/>
-          <w:numId w:val="1005"/>
+          <w:numId w:val="1008"/>
         </w:numPr>
       </w:pPr>
       <w:r>
@@ -2175,10 +2692,10 @@
         <w:t xml:space="preserve"> </w:t>
       </w:r>
       <w:r>
-        <w:t xml:space="preserve">Vurdér jeres hypoteser ud fra resultaterne: skal de forkastes, eller kan de beholdes indtil videre? Saml de vigtigste resultater — hvad ved I nu om karsens vækst og om lysets betydning for fotosyntesen?</w:t>
+        <w:t xml:space="preserve">Saml de vigtigste resultater — hvad ved I nu om karsens vækst og om lysets betydning for fotosyntesen?</w:t>
       </w:r>
     </w:p>
-    <w:bookmarkEnd w:id="36"/>
+    <w:bookmarkEnd w:id="38"/>
     <w:sectPr>
       <w:headerReference r:id="rId7" w:type="default"/>
       <w:footerReference r:id="rId8" w:type="default"/>
@@ -2706,6 +3223,176 @@
       </w:rPr>
     </w:lvl>
   </w:abstractNum>
+  <w:abstractNum w:abstractNumId="99413">
+    <w:nsid w:val="00A99413"/>
+    <w:multiLevelType w:val="multilevel"/>
+    <w:lvl w:ilvl="0">
+      <w:start w:val="3"/>
+      <w:numFmt w:val="decimal"/>
+      <w:lvlText w:val="%1."/>
+      <w:lvlJc w:val="left"/>
+      <w:pPr>
+        <w:ind w:left="720" w:hanging="360"/>
+      </w:pPr>
+    </w:lvl>
+    <w:lvl w:ilvl="1">
+      <w:start w:val="3"/>
+      <w:numFmt w:val="decimal"/>
+      <w:lvlText w:val="%2."/>
+      <w:lvlJc w:val="left"/>
+      <w:pPr>
+        <w:ind w:left="1440" w:hanging="360"/>
+      </w:pPr>
+    </w:lvl>
+    <w:lvl w:ilvl="2">
+      <w:start w:val="3"/>
+      <w:numFmt w:val="decimal"/>
+      <w:lvlText w:val="%3."/>
+      <w:lvlJc w:val="left"/>
+      <w:pPr>
+        <w:ind w:left="2160" w:hanging="360"/>
+      </w:pPr>
+    </w:lvl>
+    <w:lvl w:ilvl="3">
+      <w:start w:val="3"/>
+      <w:numFmt w:val="decimal"/>
+      <w:lvlText w:val="%4."/>
+      <w:lvlJc w:val="left"/>
+      <w:pPr>
+        <w:ind w:left="2880" w:hanging="360"/>
+      </w:pPr>
+    </w:lvl>
+    <w:lvl w:ilvl="4">
+      <w:start w:val="3"/>
+      <w:numFmt w:val="decimal"/>
+      <w:lvlText w:val="%5."/>
+      <w:lvlJc w:val="left"/>
+      <w:pPr>
+        <w:ind w:left="3600" w:hanging="360"/>
+      </w:pPr>
+    </w:lvl>
+    <w:lvl w:ilvl="5">
+      <w:start w:val="3"/>
+      <w:numFmt w:val="decimal"/>
+      <w:lvlText w:val="%6."/>
+      <w:lvlJc w:val="left"/>
+      <w:pPr>
+        <w:ind w:left="4320" w:hanging="360"/>
+      </w:pPr>
+    </w:lvl>
+    <w:lvl w:ilvl="6">
+      <w:start w:val="3"/>
+      <w:numFmt w:val="decimal"/>
+      <w:lvlText w:val="%7."/>
+      <w:lvlJc w:val="left"/>
+      <w:pPr>
+        <w:ind w:left="5040" w:hanging="360"/>
+      </w:pPr>
+    </w:lvl>
+    <w:lvl w:ilvl="7">
+      <w:start w:val="3"/>
+      <w:numFmt w:val="decimal"/>
+      <w:lvlText w:val="%8."/>
+      <w:lvlJc w:val="left"/>
+      <w:pPr>
+        <w:ind w:left="5760" w:hanging="360"/>
+      </w:pPr>
+    </w:lvl>
+    <w:lvl w:ilvl="8">
+      <w:start w:val="3"/>
+      <w:numFmt w:val="decimal"/>
+      <w:lvlText w:val="%9."/>
+      <w:lvlJc w:val="left"/>
+      <w:pPr>
+        <w:ind w:left="6480" w:hanging="360"/>
+      </w:pPr>
+    </w:lvl>
+  </w:abstractNum>
+  <w:abstractNum w:abstractNumId="99415">
+    <w:nsid w:val="00A99415"/>
+    <w:multiLevelType w:val="multilevel"/>
+    <w:lvl w:ilvl="0">
+      <w:start w:val="5"/>
+      <w:numFmt w:val="decimal"/>
+      <w:lvlText w:val="%1."/>
+      <w:lvlJc w:val="left"/>
+      <w:pPr>
+        <w:ind w:left="720" w:hanging="360"/>
+      </w:pPr>
+    </w:lvl>
+    <w:lvl w:ilvl="1">
+      <w:start w:val="5"/>
+      <w:numFmt w:val="decimal"/>
+      <w:lvlText w:val="%2."/>
+      <w:lvlJc w:val="left"/>
+      <w:pPr>
+        <w:ind w:left="1440" w:hanging="360"/>
+      </w:pPr>
+    </w:lvl>
+    <w:lvl w:ilvl="2">
+      <w:start w:val="5"/>
+      <w:numFmt w:val="decimal"/>
+      <w:lvlText w:val="%3."/>
+      <w:lvlJc w:val="left"/>
+      <w:pPr>
+        <w:ind w:left="2160" w:hanging="360"/>
+      </w:pPr>
+    </w:lvl>
+    <w:lvl w:ilvl="3">
+      <w:start w:val="5"/>
+      <w:numFmt w:val="decimal"/>
+      <w:lvlText w:val="%4."/>
+      <w:lvlJc w:val="left"/>
+      <w:pPr>
+        <w:ind w:left="2880" w:hanging="360"/>
+      </w:pPr>
+    </w:lvl>
+    <w:lvl w:ilvl="4">
+      <w:start w:val="5"/>
+      <w:numFmt w:val="decimal"/>
+      <w:lvlText w:val="%5."/>
+      <w:lvlJc w:val="left"/>
+      <w:pPr>
+        <w:ind w:left="3600" w:hanging="360"/>
+      </w:pPr>
+    </w:lvl>
+    <w:lvl w:ilvl="5">
+      <w:start w:val="5"/>
+      <w:numFmt w:val="decimal"/>
+      <w:lvlText w:val="%6."/>
+      <w:lvlJc w:val="left"/>
+      <w:pPr>
+        <w:ind w:left="4320" w:hanging="360"/>
+      </w:pPr>
+    </w:lvl>
+    <w:lvl w:ilvl="6">
+      <w:start w:val="5"/>
+      <w:numFmt w:val="decimal"/>
+      <w:lvlText w:val="%7."/>
+      <w:lvlJc w:val="left"/>
+      <w:pPr>
+        <w:ind w:left="5040" w:hanging="360"/>
+      </w:pPr>
+    </w:lvl>
+    <w:lvl w:ilvl="7">
+      <w:start w:val="5"/>
+      <w:numFmt w:val="decimal"/>
+      <w:lvlText w:val="%8."/>
+      <w:lvlJc w:val="left"/>
+      <w:pPr>
+        <w:ind w:left="5760" w:hanging="360"/>
+      </w:pPr>
+    </w:lvl>
+    <w:lvl w:ilvl="8">
+      <w:start w:val="5"/>
+      <w:numFmt w:val="decimal"/>
+      <w:lvlText w:val="%9."/>
+      <w:lvlJc w:val="left"/>
+      <w:pPr>
+        <w:ind w:left="6480" w:hanging="360"/>
+      </w:pPr>
+    </w:lvl>
+  </w:abstractNum>
   <w:num w:numId="1">
     <w:abstractNumId w:val="1"/>
     <w:lvlOverride w:ilvl="0">
@@ -2794,6 +3481,96 @@
     <w:abstractNumId w:val="991"/>
   </w:num>
   <w:num w:numId="1005">
+    <w:abstractNumId w:val="99411"/>
+    <w:lvlOverride w:ilvl="0">
+      <w:startOverride w:val="1"/>
+    </w:lvlOverride>
+    <w:lvlOverride w:ilvl="1">
+      <w:startOverride w:val="1"/>
+    </w:lvlOverride>
+    <w:lvlOverride w:ilvl="2">
+      <w:startOverride w:val="1"/>
+    </w:lvlOverride>
+    <w:lvlOverride w:ilvl="3">
+      <w:startOverride w:val="1"/>
+    </w:lvlOverride>
+    <w:lvlOverride w:ilvl="4">
+      <w:startOverride w:val="1"/>
+    </w:lvlOverride>
+    <w:lvlOverride w:ilvl="5">
+      <w:startOverride w:val="1"/>
+    </w:lvlOverride>
+    <w:lvlOverride w:ilvl="6">
+      <w:startOverride w:val="1"/>
+    </w:lvlOverride>
+    <w:lvlOverride w:ilvl="7">
+      <w:startOverride w:val="1"/>
+    </w:lvlOverride>
+    <w:lvlOverride w:ilvl="8">
+      <w:startOverride w:val="1"/>
+    </w:lvlOverride>
+  </w:num>
+  <w:num w:numId="1006">
+    <w:abstractNumId w:val="99413"/>
+    <w:lvlOverride w:ilvl="0">
+      <w:startOverride w:val="3"/>
+    </w:lvlOverride>
+    <w:lvlOverride w:ilvl="1">
+      <w:startOverride w:val="3"/>
+    </w:lvlOverride>
+    <w:lvlOverride w:ilvl="2">
+      <w:startOverride w:val="3"/>
+    </w:lvlOverride>
+    <w:lvlOverride w:ilvl="3">
+      <w:startOverride w:val="3"/>
+    </w:lvlOverride>
+    <w:lvlOverride w:ilvl="4">
+      <w:startOverride w:val="3"/>
+    </w:lvlOverride>
+    <w:lvlOverride w:ilvl="5">
+      <w:startOverride w:val="3"/>
+    </w:lvlOverride>
+    <w:lvlOverride w:ilvl="6">
+      <w:startOverride w:val="3"/>
+    </w:lvlOverride>
+    <w:lvlOverride w:ilvl="7">
+      <w:startOverride w:val="3"/>
+    </w:lvlOverride>
+    <w:lvlOverride w:ilvl="8">
+      <w:startOverride w:val="3"/>
+    </w:lvlOverride>
+  </w:num>
+  <w:num w:numId="1007">
+    <w:abstractNumId w:val="99415"/>
+    <w:lvlOverride w:ilvl="0">
+      <w:startOverride w:val="5"/>
+    </w:lvlOverride>
+    <w:lvlOverride w:ilvl="1">
+      <w:startOverride w:val="5"/>
+    </w:lvlOverride>
+    <w:lvlOverride w:ilvl="2">
+      <w:startOverride w:val="5"/>
+    </w:lvlOverride>
+    <w:lvlOverride w:ilvl="3">
+      <w:startOverride w:val="5"/>
+    </w:lvlOverride>
+    <w:lvlOverride w:ilvl="4">
+      <w:startOverride w:val="5"/>
+    </w:lvlOverride>
+    <w:lvlOverride w:ilvl="5">
+      <w:startOverride w:val="5"/>
+    </w:lvlOverride>
+    <w:lvlOverride w:ilvl="6">
+      <w:startOverride w:val="5"/>
+    </w:lvlOverride>
+    <w:lvlOverride w:ilvl="7">
+      <w:startOverride w:val="5"/>
+    </w:lvlOverride>
+    <w:lvlOverride w:ilvl="8">
+      <w:startOverride w:val="5"/>
+    </w:lvlOverride>
+  </w:num>
+  <w:num w:numId="1008">
     <w:abstractNumId w:val="99411"/>
     <w:lvlOverride w:ilvl="0">
       <w:startOverride w:val="1"/>

</xml_diff>